<commit_message>
tailwind css not working
</commit_message>
<xml_diff>
--- a/Society Project.docx
+++ b/Society Project.docx
@@ -538,8 +538,263 @@
       <w:r>
         <w:rPr>
           <w:rFonts w:ascii="Times New Roman" w:hAnsi="Times New Roman" w:cs="Times New Roman"/>
+          <w:noProof/>
         </w:rPr>
         <w:lastRenderedPageBreak/>
+        <mc:AlternateContent>
+          <mc:Choice Requires="wps">
+            <w:drawing>
+              <wp:anchor distT="0" distB="0" distL="114300" distR="114300" simplePos="0" relativeHeight="251663360" behindDoc="0" locked="0" layoutInCell="1" allowOverlap="1" wp14:anchorId="02285EC4" wp14:editId="6BA3229F">
+                <wp:simplePos x="0" y="0"/>
+                <wp:positionH relativeFrom="margin">
+                  <wp:posOffset>2305050</wp:posOffset>
+                </wp:positionH>
+                <wp:positionV relativeFrom="paragraph">
+                  <wp:posOffset>82550</wp:posOffset>
+                </wp:positionV>
+                <wp:extent cx="825500" cy="406400"/>
+                <wp:effectExtent l="0" t="0" r="12700" b="12700"/>
+                <wp:wrapNone/>
+                <wp:docPr id="2029356689" name="Rectangle 1"/>
+                <wp:cNvGraphicFramePr/>
+                <a:graphic xmlns:a="http://schemas.openxmlformats.org/drawingml/2006/main">
+                  <a:graphicData uri="http://schemas.microsoft.com/office/word/2010/wordprocessingShape">
+                    <wps:wsp>
+                      <wps:cNvSpPr/>
+                      <wps:spPr>
+                        <a:xfrm>
+                          <a:off x="0" y="0"/>
+                          <a:ext cx="825500" cy="406400"/>
+                        </a:xfrm>
+                        <a:prstGeom prst="rect">
+                          <a:avLst/>
+                        </a:prstGeom>
+                      </wps:spPr>
+                      <wps:style>
+                        <a:lnRef idx="2">
+                          <a:schemeClr val="accent4">
+                            <a:shade val="15000"/>
+                          </a:schemeClr>
+                        </a:lnRef>
+                        <a:fillRef idx="1">
+                          <a:schemeClr val="accent4"/>
+                        </a:fillRef>
+                        <a:effectRef idx="0">
+                          <a:schemeClr val="accent4"/>
+                        </a:effectRef>
+                        <a:fontRef idx="minor">
+                          <a:schemeClr val="lt1"/>
+                        </a:fontRef>
+                      </wps:style>
+                      <wps:txbx>
+                        <w:txbxContent>
+                          <w:p>
+                            <w:pPr>
+                              <w:jc w:val="center"/>
+                              <w:rPr>
+                                <w:b/>
+                                <w:bCs/>
+                                <w:color w:val="EE0000"/>
+                              </w:rPr>
+                            </w:pPr>
+                            <w:r>
+                              <w:rPr>
+                                <w:b/>
+                                <w:bCs/>
+                                <w:color w:val="EE0000"/>
+                              </w:rPr>
+                              <w:t>Months</w:t>
+                            </w:r>
+                            <w:r>
+                              <w:rPr>
+                                <w:b/>
+                                <w:bCs/>
+                                <w:color w:val="EE0000"/>
+                              </w:rPr>
+                              <w:t>2</w:t>
+                            </w:r>
+                          </w:p>
+                        </w:txbxContent>
+                      </wps:txbx>
+                      <wps:bodyPr rot="0" spcFirstLastPara="0" vertOverflow="overflow" horzOverflow="overflow" vert="horz" wrap="square" lIns="91440" tIns="45720" rIns="91440" bIns="45720" numCol="1" spcCol="0" rtlCol="0" fromWordArt="0" anchor="ctr" anchorCtr="0" forceAA="0" compatLnSpc="1">
+                        <a:prstTxWarp prst="textNoShape">
+                          <a:avLst/>
+                        </a:prstTxWarp>
+                        <a:noAutofit/>
+                      </wps:bodyPr>
+                    </wps:wsp>
+                  </a:graphicData>
+                </a:graphic>
+                <wp14:sizeRelH relativeFrom="margin">
+                  <wp14:pctWidth>0</wp14:pctWidth>
+                </wp14:sizeRelH>
+                <wp14:sizeRelV relativeFrom="margin">
+                  <wp14:pctHeight>0</wp14:pctHeight>
+                </wp14:sizeRelV>
+              </wp:anchor>
+            </w:drawing>
+          </mc:Choice>
+          <mc:Fallback>
+            <w:pict>
+              <v:rect w14:anchorId="02285EC4" id="Rectangle 1" o:spid="_x0000_s1026" style="position:absolute;margin-left:181.5pt;margin-top:6.5pt;width:65pt;height:32pt;z-index:251663360;visibility:visible;mso-wrap-style:square;mso-width-percent:0;mso-height-percent:0;mso-wrap-distance-left:9pt;mso-wrap-distance-top:0;mso-wrap-distance-right:9pt;mso-wrap-distance-bottom:0;mso-position-horizontal:absolute;mso-position-horizontal-relative:margin;mso-position-vertical:absolute;mso-position-vertical-relative:text;mso-width-percent:0;mso-height-percent:0;mso-width-relative:margin;mso-height-relative:margin;v-text-anchor:middle" o:gfxdata="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" fillcolor="#ffc000 [3207]" strokecolor="#261c00 [487]" strokeweight="1pt">
+                <v:textbox>
+                  <w:txbxContent>
+                    <w:p>
+                      <w:pPr>
+                        <w:jc w:val="center"/>
+                        <w:rPr>
+                          <w:b/>
+                          <w:bCs/>
+                          <w:color w:val="EE0000"/>
+                        </w:rPr>
+                      </w:pPr>
+                      <w:r>
+                        <w:rPr>
+                          <w:b/>
+                          <w:bCs/>
+                          <w:color w:val="EE0000"/>
+                        </w:rPr>
+                        <w:t>Months</w:t>
+                      </w:r>
+                      <w:r>
+                        <w:rPr>
+                          <w:b/>
+                          <w:bCs/>
+                          <w:color w:val="EE0000"/>
+                        </w:rPr>
+                        <w:t>2</w:t>
+                      </w:r>
+                    </w:p>
+                  </w:txbxContent>
+                </v:textbox>
+                <w10:wrap anchorx="margin"/>
+              </v:rect>
+            </w:pict>
+          </mc:Fallback>
+        </mc:AlternateContent>
+      </w:r>
+      <w:r>
+        <w:rPr>
+          <w:rFonts w:ascii="Times New Roman" w:hAnsi="Times New Roman" w:cs="Times New Roman"/>
+          <w:noProof/>
+        </w:rPr>
+        <mc:AlternateContent>
+          <mc:Choice Requires="wps">
+            <w:drawing>
+              <wp:anchor distT="0" distB="0" distL="114300" distR="114300" simplePos="0" relativeHeight="251661312" behindDoc="0" locked="0" layoutInCell="1" allowOverlap="1" wp14:anchorId="1DF02DEF" wp14:editId="18F1D8E2">
+                <wp:simplePos x="0" y="0"/>
+                <wp:positionH relativeFrom="margin">
+                  <wp:posOffset>1371600</wp:posOffset>
+                </wp:positionH>
+                <wp:positionV relativeFrom="paragraph">
+                  <wp:posOffset>95250</wp:posOffset>
+                </wp:positionV>
+                <wp:extent cx="825500" cy="381000"/>
+                <wp:effectExtent l="0" t="0" r="12700" b="19050"/>
+                <wp:wrapNone/>
+                <wp:docPr id="1706274012" name="Rectangle 1"/>
+                <wp:cNvGraphicFramePr/>
+                <a:graphic xmlns:a="http://schemas.openxmlformats.org/drawingml/2006/main">
+                  <a:graphicData uri="http://schemas.microsoft.com/office/word/2010/wordprocessingShape">
+                    <wps:wsp>
+                      <wps:cNvSpPr/>
+                      <wps:spPr>
+                        <a:xfrm>
+                          <a:off x="0" y="0"/>
+                          <a:ext cx="825500" cy="381000"/>
+                        </a:xfrm>
+                        <a:prstGeom prst="rect">
+                          <a:avLst/>
+                        </a:prstGeom>
+                      </wps:spPr>
+                      <wps:style>
+                        <a:lnRef idx="2">
+                          <a:schemeClr val="accent4">
+                            <a:shade val="15000"/>
+                          </a:schemeClr>
+                        </a:lnRef>
+                        <a:fillRef idx="1">
+                          <a:schemeClr val="accent4"/>
+                        </a:fillRef>
+                        <a:effectRef idx="0">
+                          <a:schemeClr val="accent4"/>
+                        </a:effectRef>
+                        <a:fontRef idx="minor">
+                          <a:schemeClr val="lt1"/>
+                        </a:fontRef>
+                      </wps:style>
+                      <wps:txbx>
+                        <w:txbxContent>
+                          <w:p>
+                            <w:pPr>
+                              <w:jc w:val="center"/>
+                              <w:rPr>
+                                <w:b/>
+                                <w:bCs/>
+                                <w:color w:val="EE0000"/>
+                              </w:rPr>
+                            </w:pPr>
+                            <w:r>
+                              <w:rPr>
+                                <w:b/>
+                                <w:bCs/>
+                                <w:color w:val="EE0000"/>
+                              </w:rPr>
+                              <w:t>Months1</w:t>
+                            </w:r>
+                          </w:p>
+                        </w:txbxContent>
+                      </wps:txbx>
+                      <wps:bodyPr rot="0" spcFirstLastPara="0" vertOverflow="overflow" horzOverflow="overflow" vert="horz" wrap="square" lIns="91440" tIns="45720" rIns="91440" bIns="45720" numCol="1" spcCol="0" rtlCol="0" fromWordArt="0" anchor="ctr" anchorCtr="0" forceAA="0" compatLnSpc="1">
+                        <a:prstTxWarp prst="textNoShape">
+                          <a:avLst/>
+                        </a:prstTxWarp>
+                        <a:noAutofit/>
+                      </wps:bodyPr>
+                    </wps:wsp>
+                  </a:graphicData>
+                </a:graphic>
+                <wp14:sizeRelH relativeFrom="margin">
+                  <wp14:pctWidth>0</wp14:pctWidth>
+                </wp14:sizeRelH>
+              </wp:anchor>
+            </w:drawing>
+          </mc:Choice>
+          <mc:Fallback>
+            <w:pict>
+              <v:rect w14:anchorId="1DF02DEF" id="_x0000_s1027" style="position:absolute;margin-left:108pt;margin-top:7.5pt;width:65pt;height:30pt;z-index:251661312;visibility:visible;mso-wrap-style:square;mso-width-percent:0;mso-wrap-distance-left:9pt;mso-wrap-distance-top:0;mso-wrap-distance-right:9pt;mso-wrap-distance-bottom:0;mso-position-horizontal:absolute;mso-position-horizontal-relative:margin;mso-position-vertical:absolute;mso-position-vertical-relative:text;mso-width-percent:0;mso-width-relative:margin;v-text-anchor:middle" o:gfxdata="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" fillcolor="#ffc000 [3207]" strokecolor="#261c00 [487]" strokeweight="1pt">
+                <v:textbox>
+                  <w:txbxContent>
+                    <w:p>
+                      <w:pPr>
+                        <w:jc w:val="center"/>
+                        <w:rPr>
+                          <w:b/>
+                          <w:bCs/>
+                          <w:color w:val="EE0000"/>
+                        </w:rPr>
+                      </w:pPr>
+                      <w:r>
+                        <w:rPr>
+                          <w:b/>
+                          <w:bCs/>
+                          <w:color w:val="EE0000"/>
+                        </w:rPr>
+                        <w:t>Months1</w:t>
+                      </w:r>
+                    </w:p>
+                  </w:txbxContent>
+                </v:textbox>
+                <w10:wrap anchorx="margin"/>
+              </v:rect>
+            </w:pict>
+          </mc:Fallback>
+        </mc:AlternateContent>
+      </w:r>
+      <w:r>
+        <w:rPr>
+          <w:rFonts w:ascii="Times New Roman" w:hAnsi="Times New Roman" w:cs="Times New Roman"/>
+        </w:rPr>
         <w:t>Basic Logic</w:t>
       </w:r>
     </w:p>
@@ -549,6 +804,397 @@
           <w:rFonts w:ascii="Times New Roman" w:hAnsi="Times New Roman" w:cs="Times New Roman"/>
         </w:rPr>
       </w:pPr>
+      <w:r>
+        <w:rPr>
+          <w:rFonts w:ascii="Times New Roman" w:hAnsi="Times New Roman" w:cs="Times New Roman"/>
+          <w:noProof/>
+        </w:rPr>
+        <mc:AlternateContent>
+          <mc:Choice Requires="wps">
+            <w:drawing>
+              <wp:anchor distT="0" distB="0" distL="114300" distR="114300" simplePos="0" relativeHeight="251664384" behindDoc="0" locked="0" layoutInCell="1" allowOverlap="1" wp14:anchorId="79B1E9C7" wp14:editId="4E78EB4D">
+                <wp:simplePos x="0" y="0"/>
+                <wp:positionH relativeFrom="column">
+                  <wp:posOffset>1828800</wp:posOffset>
+                </wp:positionH>
+                <wp:positionV relativeFrom="paragraph">
+                  <wp:posOffset>209550</wp:posOffset>
+                </wp:positionV>
+                <wp:extent cx="101600" cy="609600"/>
+                <wp:effectExtent l="38100" t="38100" r="69850" b="57150"/>
+                <wp:wrapNone/>
+                <wp:docPr id="1707935037" name="Straight Arrow Connector 3"/>
+                <wp:cNvGraphicFramePr/>
+                <a:graphic xmlns:a="http://schemas.openxmlformats.org/drawingml/2006/main">
+                  <a:graphicData uri="http://schemas.microsoft.com/office/word/2010/wordprocessingShape">
+                    <wps:wsp>
+                      <wps:cNvCnPr/>
+                      <wps:spPr>
+                        <a:xfrm flipH="1" flipV="1">
+                          <a:off x="0" y="0"/>
+                          <a:ext cx="101600" cy="609600"/>
+                        </a:xfrm>
+                        <a:prstGeom prst="straightConnector1">
+                          <a:avLst/>
+                        </a:prstGeom>
+                        <a:ln>
+                          <a:solidFill>
+                            <a:srgbClr val="FFC000"/>
+                          </a:solidFill>
+                          <a:headEnd type="triangle"/>
+                          <a:tailEnd type="triangle"/>
+                        </a:ln>
+                      </wps:spPr>
+                      <wps:style>
+                        <a:lnRef idx="1">
+                          <a:schemeClr val="accent1"/>
+                        </a:lnRef>
+                        <a:fillRef idx="0">
+                          <a:schemeClr val="accent1"/>
+                        </a:fillRef>
+                        <a:effectRef idx="0">
+                          <a:schemeClr val="accent1"/>
+                        </a:effectRef>
+                        <a:fontRef idx="minor">
+                          <a:schemeClr val="tx1"/>
+                        </a:fontRef>
+                      </wps:style>
+                      <wps:bodyPr/>
+                    </wps:wsp>
+                  </a:graphicData>
+                </a:graphic>
+                <wp14:sizeRelH relativeFrom="margin">
+                  <wp14:pctWidth>0</wp14:pctWidth>
+                </wp14:sizeRelH>
+                <wp14:sizeRelV relativeFrom="margin">
+                  <wp14:pctHeight>0</wp14:pctHeight>
+                </wp14:sizeRelV>
+              </wp:anchor>
+            </w:drawing>
+          </mc:Choice>
+          <mc:Fallback>
+            <w:pict>
+              <v:shapetype w14:anchorId="0AC1F324" id="_x0000_t32" coordsize="21600,21600" o:spt="32" o:oned="t" path="m,l21600,21600e" filled="f">
+                <v:path arrowok="t" fillok="f" o:connecttype="none"/>
+                <o:lock v:ext="edit" shapetype="t"/>
+              </v:shapetype>
+              <v:shape id="Straight Arrow Connector 3" o:spid="_x0000_s1026" type="#_x0000_t32" style="position:absolute;margin-left:2in;margin-top:16.5pt;width:8pt;height:48pt;flip:x y;z-index:251664384;visibility:visible;mso-wrap-style:square;mso-width-percent:0;mso-height-percent:0;mso-wrap-distance-left:9pt;mso-wrap-distance-top:0;mso-wrap-distance-right:9pt;mso-wrap-distance-bottom:0;mso-position-horizontal:absolute;mso-position-horizontal-relative:text;mso-position-vertical:absolute;mso-position-vertical-relative:text;mso-width-percent:0;mso-height-percent:0;mso-width-relative:margin;mso-height-relative:margin" o:gfxdata="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" strokecolor="#ffc000" strokeweight=".5pt">
+                <v:stroke startarrow="block" endarrow="block" joinstyle="miter"/>
+              </v:shape>
+            </w:pict>
+          </mc:Fallback>
+        </mc:AlternateContent>
+      </w:r>
+      <w:r>
+        <w:rPr>
+          <w:rFonts w:ascii="Times New Roman" w:hAnsi="Times New Roman" w:cs="Times New Roman"/>
+          <w:noProof/>
+        </w:rPr>
+        <mc:AlternateContent>
+          <mc:Choice Requires="wps">
+            <w:drawing>
+              <wp:anchor distT="0" distB="0" distL="114300" distR="114300" simplePos="0" relativeHeight="251665408" behindDoc="0" locked="0" layoutInCell="1" allowOverlap="1" wp14:anchorId="1036139B" wp14:editId="0AEDFDF4">
+                <wp:simplePos x="0" y="0"/>
+                <wp:positionH relativeFrom="column">
+                  <wp:posOffset>2171700</wp:posOffset>
+                </wp:positionH>
+                <wp:positionV relativeFrom="paragraph">
+                  <wp:posOffset>228600</wp:posOffset>
+                </wp:positionV>
+                <wp:extent cx="584200" cy="622300"/>
+                <wp:effectExtent l="38100" t="38100" r="63500" b="63500"/>
+                <wp:wrapNone/>
+                <wp:docPr id="799437999" name="Straight Arrow Connector 4"/>
+                <wp:cNvGraphicFramePr/>
+                <a:graphic xmlns:a="http://schemas.openxmlformats.org/drawingml/2006/main">
+                  <a:graphicData uri="http://schemas.microsoft.com/office/word/2010/wordprocessingShape">
+                    <wps:wsp>
+                      <wps:cNvCnPr/>
+                      <wps:spPr>
+                        <a:xfrm flipV="1">
+                          <a:off x="0" y="0"/>
+                          <a:ext cx="584200" cy="622300"/>
+                        </a:xfrm>
+                        <a:prstGeom prst="straightConnector1">
+                          <a:avLst/>
+                        </a:prstGeom>
+                        <a:ln>
+                          <a:solidFill>
+                            <a:srgbClr val="FFC000"/>
+                          </a:solidFill>
+                          <a:headEnd type="triangle"/>
+                          <a:tailEnd type="triangle"/>
+                        </a:ln>
+                      </wps:spPr>
+                      <wps:style>
+                        <a:lnRef idx="1">
+                          <a:schemeClr val="accent1"/>
+                        </a:lnRef>
+                        <a:fillRef idx="0">
+                          <a:schemeClr val="accent1"/>
+                        </a:fillRef>
+                        <a:effectRef idx="0">
+                          <a:schemeClr val="accent1"/>
+                        </a:effectRef>
+                        <a:fontRef idx="minor">
+                          <a:schemeClr val="tx1"/>
+                        </a:fontRef>
+                      </wps:style>
+                      <wps:bodyPr/>
+                    </wps:wsp>
+                  </a:graphicData>
+                </a:graphic>
+                <wp14:sizeRelH relativeFrom="margin">
+                  <wp14:pctWidth>0</wp14:pctWidth>
+                </wp14:sizeRelH>
+                <wp14:sizeRelV relativeFrom="margin">
+                  <wp14:pctHeight>0</wp14:pctHeight>
+                </wp14:sizeRelV>
+              </wp:anchor>
+            </w:drawing>
+          </mc:Choice>
+          <mc:Fallback>
+            <w:pict>
+              <v:shape w14:anchorId="431A677B" id="Straight Arrow Connector 4" o:spid="_x0000_s1026" type="#_x0000_t32" style="position:absolute;margin-left:171pt;margin-top:18pt;width:46pt;height:49pt;flip:y;z-index:251665408;visibility:visible;mso-wrap-style:square;mso-width-percent:0;mso-height-percent:0;mso-wrap-distance-left:9pt;mso-wrap-distance-top:0;mso-wrap-distance-right:9pt;mso-wrap-distance-bottom:0;mso-position-horizontal:absolute;mso-position-horizontal-relative:text;mso-position-vertical:absolute;mso-position-vertical-relative:text;mso-width-percent:0;mso-height-percent:0;mso-width-relative:margin;mso-height-relative:margin" o:gfxdata="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" strokecolor="#ffc000" strokeweight=".5pt">
+                <v:stroke startarrow="block" endarrow="block" joinstyle="miter"/>
+              </v:shape>
+            </w:pict>
+          </mc:Fallback>
+        </mc:AlternateContent>
+      </w:r>
+      <w:r>
+        <w:rPr>
+          <w:rFonts w:ascii="Times New Roman" w:hAnsi="Times New Roman" w:cs="Times New Roman"/>
+          <w:noProof/>
+        </w:rPr>
+        <mc:AlternateContent>
+          <mc:Choice Requires="wps">
+            <w:drawing>
+              <wp:anchor distT="0" distB="0" distL="114300" distR="114300" simplePos="0" relativeHeight="251666432" behindDoc="0" locked="0" layoutInCell="1" allowOverlap="1" wp14:anchorId="7BA9B535" wp14:editId="28D6923C">
+                <wp:simplePos x="0" y="0"/>
+                <wp:positionH relativeFrom="column">
+                  <wp:posOffset>1416050</wp:posOffset>
+                </wp:positionH>
+                <wp:positionV relativeFrom="paragraph">
+                  <wp:posOffset>850900</wp:posOffset>
+                </wp:positionV>
+                <wp:extent cx="1219200" cy="482600"/>
+                <wp:effectExtent l="0" t="0" r="19050" b="12700"/>
+                <wp:wrapNone/>
+                <wp:docPr id="781888413" name="Oval 5"/>
+                <wp:cNvGraphicFramePr/>
+                <a:graphic xmlns:a="http://schemas.openxmlformats.org/drawingml/2006/main">
+                  <a:graphicData uri="http://schemas.microsoft.com/office/word/2010/wordprocessingShape">
+                    <wps:wsp>
+                      <wps:cNvSpPr/>
+                      <wps:spPr>
+                        <a:xfrm>
+                          <a:off x="0" y="0"/>
+                          <a:ext cx="1219200" cy="482600"/>
+                        </a:xfrm>
+                        <a:prstGeom prst="ellipse">
+                          <a:avLst/>
+                        </a:prstGeom>
+                        <a:solidFill>
+                          <a:srgbClr val="FFC000"/>
+                        </a:solidFill>
+                        <a:ln>
+                          <a:solidFill>
+                            <a:srgbClr val="FFC000"/>
+                          </a:solidFill>
+                        </a:ln>
+                      </wps:spPr>
+                      <wps:style>
+                        <a:lnRef idx="2">
+                          <a:schemeClr val="accent1">
+                            <a:shade val="15000"/>
+                          </a:schemeClr>
+                        </a:lnRef>
+                        <a:fillRef idx="1">
+                          <a:schemeClr val="accent1"/>
+                        </a:fillRef>
+                        <a:effectRef idx="0">
+                          <a:schemeClr val="accent1"/>
+                        </a:effectRef>
+                        <a:fontRef idx="minor">
+                          <a:schemeClr val="lt1"/>
+                        </a:fontRef>
+                      </wps:style>
+                      <wps:txbx>
+                        <w:txbxContent>
+                          <w:p>
+                            <w:pPr>
+                              <w:jc w:val="center"/>
+                              <w:rPr>
+                                <w:color w:val="EE0000"/>
+                              </w:rPr>
+                            </w:pPr>
+                            <w:r>
+                              <w:rPr>
+                                <w:color w:val="EE0000"/>
+                              </w:rPr>
+                              <w:t>Payments</w:t>
+                            </w:r>
+                          </w:p>
+                        </w:txbxContent>
+                      </wps:txbx>
+                      <wps:bodyPr rot="0" spcFirstLastPara="0" vertOverflow="overflow" horzOverflow="overflow" vert="horz" wrap="square" lIns="91440" tIns="45720" rIns="91440" bIns="45720" numCol="1" spcCol="0" rtlCol="0" fromWordArt="0" anchor="ctr" anchorCtr="0" forceAA="0" compatLnSpc="1">
+                        <a:prstTxWarp prst="textNoShape">
+                          <a:avLst/>
+                        </a:prstTxWarp>
+                        <a:noAutofit/>
+                      </wps:bodyPr>
+                    </wps:wsp>
+                  </a:graphicData>
+                </a:graphic>
+                <wp14:sizeRelH relativeFrom="margin">
+                  <wp14:pctWidth>0</wp14:pctWidth>
+                </wp14:sizeRelH>
+              </wp:anchor>
+            </w:drawing>
+          </mc:Choice>
+          <mc:Fallback>
+            <w:pict>
+              <v:oval w14:anchorId="7BA9B535" id="Oval 5" o:spid="_x0000_s1028" style="position:absolute;margin-left:111.5pt;margin-top:67pt;width:96pt;height:38pt;z-index:251666432;visibility:visible;mso-wrap-style:square;mso-width-percent:0;mso-wrap-distance-left:9pt;mso-wrap-distance-top:0;mso-wrap-distance-right:9pt;mso-wrap-distance-bottom:0;mso-position-horizontal:absolute;mso-position-horizontal-relative:text;mso-position-vertical:absolute;mso-position-vertical-relative:text;mso-width-percent:0;mso-width-relative:margin;v-text-anchor:middle" o:gfxdata="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" fillcolor="#ffc000" strokecolor="#ffc000" strokeweight="1pt">
+                <v:stroke joinstyle="miter"/>
+                <v:textbox>
+                  <w:txbxContent>
+                    <w:p>
+                      <w:pPr>
+                        <w:jc w:val="center"/>
+                        <w:rPr>
+                          <w:color w:val="EE0000"/>
+                        </w:rPr>
+                      </w:pPr>
+                      <w:r>
+                        <w:rPr>
+                          <w:color w:val="EE0000"/>
+                        </w:rPr>
+                        <w:t>Payments</w:t>
+                      </w:r>
+                    </w:p>
+                  </w:txbxContent>
+                </v:textbox>
+              </v:oval>
+            </w:pict>
+          </mc:Fallback>
+        </mc:AlternateContent>
+      </w:r>
+      <w:r>
+        <w:rPr>
+          <w:rFonts w:ascii="Times New Roman" w:hAnsi="Times New Roman" w:cs="Times New Roman"/>
+          <w:noProof/>
+        </w:rPr>
+        <mc:AlternateContent>
+          <mc:Choice Requires="wps">
+            <w:drawing>
+              <wp:anchor distT="0" distB="0" distL="114300" distR="114300" simplePos="0" relativeHeight="251659264" behindDoc="0" locked="0" layoutInCell="1" allowOverlap="1" wp14:anchorId="3636DF2F" wp14:editId="7E3F855F">
+                <wp:simplePos x="0" y="0"/>
+                <wp:positionH relativeFrom="margin">
+                  <wp:align>left</wp:align>
+                </wp:positionH>
+                <wp:positionV relativeFrom="paragraph">
+                  <wp:posOffset>914400</wp:posOffset>
+                </wp:positionV>
+                <wp:extent cx="660400" cy="381000"/>
+                <wp:effectExtent l="0" t="0" r="25400" b="19050"/>
+                <wp:wrapNone/>
+                <wp:docPr id="986201717" name="Rectangle 1"/>
+                <wp:cNvGraphicFramePr/>
+                <a:graphic xmlns:a="http://schemas.openxmlformats.org/drawingml/2006/main">
+                  <a:graphicData uri="http://schemas.microsoft.com/office/word/2010/wordprocessingShape">
+                    <wps:wsp>
+                      <wps:cNvSpPr/>
+                      <wps:spPr>
+                        <a:xfrm>
+                          <a:off x="0" y="0"/>
+                          <a:ext cx="660400" cy="381000"/>
+                        </a:xfrm>
+                        <a:prstGeom prst="rect">
+                          <a:avLst/>
+                        </a:prstGeom>
+                      </wps:spPr>
+                      <wps:style>
+                        <a:lnRef idx="2">
+                          <a:schemeClr val="accent4">
+                            <a:shade val="15000"/>
+                          </a:schemeClr>
+                        </a:lnRef>
+                        <a:fillRef idx="1">
+                          <a:schemeClr val="accent4"/>
+                        </a:fillRef>
+                        <a:effectRef idx="0">
+                          <a:schemeClr val="accent4"/>
+                        </a:effectRef>
+                        <a:fontRef idx="minor">
+                          <a:schemeClr val="lt1"/>
+                        </a:fontRef>
+                      </wps:style>
+                      <wps:txbx>
+                        <w:txbxContent>
+                          <w:p>
+                            <w:pPr>
+                              <w:jc w:val="center"/>
+                              <w:rPr>
+                                <w:b/>
+                                <w:bCs/>
+                                <w:color w:val="EE0000"/>
+                              </w:rPr>
+                            </w:pPr>
+                            <w:r>
+                              <w:rPr>
+                                <w:b/>
+                                <w:bCs/>
+                                <w:color w:val="EE0000"/>
+                              </w:rPr>
+                              <w:t>Users</w:t>
+                            </w:r>
+                          </w:p>
+                        </w:txbxContent>
+                      </wps:txbx>
+                      <wps:bodyPr rot="0" spcFirstLastPara="0" vertOverflow="overflow" horzOverflow="overflow" vert="horz" wrap="square" lIns="91440" tIns="45720" rIns="91440" bIns="45720" numCol="1" spcCol="0" rtlCol="0" fromWordArt="0" anchor="ctr" anchorCtr="0" forceAA="0" compatLnSpc="1">
+                        <a:prstTxWarp prst="textNoShape">
+                          <a:avLst/>
+                        </a:prstTxWarp>
+                        <a:noAutofit/>
+                      </wps:bodyPr>
+                    </wps:wsp>
+                  </a:graphicData>
+                </a:graphic>
+              </wp:anchor>
+            </w:drawing>
+          </mc:Choice>
+          <mc:Fallback>
+            <w:pict>
+              <v:rect w14:anchorId="3636DF2F" id="_x0000_s1029" style="position:absolute;margin-left:0;margin-top:1in;width:52pt;height:30pt;z-index:251659264;visibility:visible;mso-wrap-style:square;mso-wrap-distance-left:9pt;mso-wrap-distance-top:0;mso-wrap-distance-right:9pt;mso-wrap-distance-bottom:0;mso-position-horizontal:left;mso-position-horizontal-relative:margin;mso-position-vertical:absolute;mso-position-vertical-relative:text;v-text-anchor:middle" o:gfxdata="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" fillcolor="#ffc000 [3207]" strokecolor="#261c00 [487]" strokeweight="1pt">
+                <v:textbox>
+                  <w:txbxContent>
+                    <w:p>
+                      <w:pPr>
+                        <w:jc w:val="center"/>
+                        <w:rPr>
+                          <w:b/>
+                          <w:bCs/>
+                          <w:color w:val="EE0000"/>
+                        </w:rPr>
+                      </w:pPr>
+                      <w:r>
+                        <w:rPr>
+                          <w:b/>
+                          <w:bCs/>
+                          <w:color w:val="EE0000"/>
+                        </w:rPr>
+                        <w:t>Users</w:t>
+                      </w:r>
+                    </w:p>
+                  </w:txbxContent>
+                </v:textbox>
+                <w10:wrap anchorx="margin"/>
+              </v:rect>
+            </w:pict>
+          </mc:Fallback>
+        </mc:AlternateContent>
+      </w:r>
     </w:p>
     <w:p>
       <w:pPr>
@@ -556,6 +1202,187 @@
           <w:rFonts w:ascii="Times New Roman" w:hAnsi="Times New Roman" w:cs="Times New Roman"/>
         </w:rPr>
       </w:pPr>
+    </w:p>
+    <w:p>
+      <w:pPr>
+        <w:rPr>
+          <w:rFonts w:ascii="Times New Roman" w:hAnsi="Times New Roman" w:cs="Times New Roman"/>
+        </w:rPr>
+      </w:pPr>
+    </w:p>
+    <w:p>
+      <w:pPr>
+        <w:rPr>
+          <w:rFonts w:ascii="Times New Roman" w:hAnsi="Times New Roman" w:cs="Times New Roman"/>
+        </w:rPr>
+      </w:pPr>
+    </w:p>
+    <w:p>
+      <w:pPr>
+        <w:rPr>
+          <w:rFonts w:ascii="Times New Roman" w:hAnsi="Times New Roman" w:cs="Times New Roman"/>
+        </w:rPr>
+      </w:pPr>
+    </w:p>
+    <w:p>
+      <w:pPr>
+        <w:rPr>
+          <w:rFonts w:ascii="Times New Roman" w:hAnsi="Times New Roman" w:cs="Times New Roman"/>
+        </w:rPr>
+      </w:pPr>
+    </w:p>
+    <w:p>
+      <w:pPr>
+        <w:rPr>
+          <w:rFonts w:ascii="Times New Roman" w:hAnsi="Times New Roman" w:cs="Times New Roman"/>
+        </w:rPr>
+      </w:pPr>
+      <w:r>
+        <w:rPr>
+          <w:rFonts w:ascii="Times New Roman" w:hAnsi="Times New Roman" w:cs="Times New Roman"/>
+        </w:rPr>
+        <w:t xml:space="preserve">List of users </w:t>
+      </w:r>
+    </w:p>
+    <w:p>
+      <w:pPr>
+        <w:rPr>
+          <w:rFonts w:ascii="Times New Roman" w:hAnsi="Times New Roman" w:cs="Times New Roman"/>
+        </w:rPr>
+      </w:pPr>
+      <w:r>
+        <w:rPr>
+          <w:rFonts w:ascii="Times New Roman" w:hAnsi="Times New Roman" w:cs="Times New Roman"/>
+        </w:rPr>
+        <w:t xml:space="preserve">List of months </w:t>
+      </w:r>
+      <w:proofErr w:type="gramStart"/>
+      <w:r>
+        <w:rPr>
+          <w:rFonts w:ascii="Times New Roman" w:hAnsi="Times New Roman" w:cs="Times New Roman"/>
+        </w:rPr>
+        <w:t>( month</w:t>
+      </w:r>
+      <w:proofErr w:type="gramEnd"/>
+      <w:r>
+        <w:rPr>
+          <w:rFonts w:ascii="Times New Roman" w:hAnsi="Times New Roman" w:cs="Times New Roman"/>
+        </w:rPr>
+        <w:t xml:space="preserve">1, month2, </w:t>
+      </w:r>
+      <w:proofErr w:type="gramStart"/>
+      <w:r>
+        <w:rPr>
+          <w:rFonts w:ascii="Times New Roman" w:hAnsi="Times New Roman" w:cs="Times New Roman"/>
+        </w:rPr>
+        <w:t>….</w:t>
+      </w:r>
+      <w:proofErr w:type="spellStart"/>
+      <w:r>
+        <w:rPr>
+          <w:rFonts w:ascii="Times New Roman" w:hAnsi="Times New Roman" w:cs="Times New Roman"/>
+        </w:rPr>
+        <w:t>etc</w:t>
+      </w:r>
+      <w:proofErr w:type="spellEnd"/>
+      <w:proofErr w:type="gramEnd"/>
+      <w:r>
+        <w:rPr>
+          <w:rFonts w:ascii="Times New Roman" w:hAnsi="Times New Roman" w:cs="Times New Roman"/>
+        </w:rPr>
+        <w:t xml:space="preserve"> ) can be filter users</w:t>
+      </w:r>
+      <w:r>
+        <w:rPr>
+          <w:rFonts w:ascii="Times New Roman" w:hAnsi="Times New Roman" w:cs="Times New Roman"/>
+        </w:rPr>
+        <w:t xml:space="preserve"> and status</w:t>
+      </w:r>
+      <w:r>
+        <w:rPr>
+          <w:rFonts w:ascii="Times New Roman" w:hAnsi="Times New Roman" w:cs="Times New Roman"/>
+        </w:rPr>
+        <w:t xml:space="preserve"> through month</w:t>
+      </w:r>
+    </w:p>
+    <w:p>
+      <w:pPr>
+        <w:rPr>
+          <w:rFonts w:ascii="Times New Roman" w:hAnsi="Times New Roman" w:cs="Times New Roman"/>
+        </w:rPr>
+      </w:pPr>
+      <w:r>
+        <w:rPr>
+          <w:rFonts w:ascii="Times New Roman" w:hAnsi="Times New Roman" w:cs="Times New Roman"/>
+        </w:rPr>
+        <w:t xml:space="preserve">Payments </w:t>
+      </w:r>
+      <w:proofErr w:type="gramStart"/>
+      <w:r>
+        <w:rPr>
+          <w:rFonts w:ascii="Times New Roman" w:hAnsi="Times New Roman" w:cs="Times New Roman"/>
+        </w:rPr>
+        <w:t>( Payments</w:t>
+      </w:r>
+      <w:proofErr w:type="gramEnd"/>
+      <w:r>
+        <w:rPr>
+          <w:rFonts w:ascii="Times New Roman" w:hAnsi="Times New Roman" w:cs="Times New Roman"/>
+        </w:rPr>
+        <w:t xml:space="preserve">1, </w:t>
+      </w:r>
+      <w:r>
+        <w:rPr>
+          <w:rFonts w:ascii="Times New Roman" w:hAnsi="Times New Roman" w:cs="Times New Roman"/>
+        </w:rPr>
+        <w:t>Payments</w:t>
+      </w:r>
+      <w:r>
+        <w:rPr>
+          <w:rFonts w:ascii="Times New Roman" w:hAnsi="Times New Roman" w:cs="Times New Roman"/>
+        </w:rPr>
+        <w:t xml:space="preserve">2, </w:t>
+      </w:r>
+      <w:proofErr w:type="gramStart"/>
+      <w:r>
+        <w:rPr>
+          <w:rFonts w:ascii="Times New Roman" w:hAnsi="Times New Roman" w:cs="Times New Roman"/>
+        </w:rPr>
+        <w:t>….</w:t>
+      </w:r>
+      <w:proofErr w:type="spellStart"/>
+      <w:r>
+        <w:rPr>
+          <w:rFonts w:ascii="Times New Roman" w:hAnsi="Times New Roman" w:cs="Times New Roman"/>
+        </w:rPr>
+        <w:t>etc</w:t>
+      </w:r>
+      <w:proofErr w:type="spellEnd"/>
+      <w:proofErr w:type="gramEnd"/>
+      <w:r>
+        <w:rPr>
+          <w:rFonts w:ascii="Times New Roman" w:hAnsi="Times New Roman" w:cs="Times New Roman"/>
+        </w:rPr>
+        <w:t xml:space="preserve"> ) can be filter users</w:t>
+      </w:r>
+      <w:r>
+        <w:rPr>
+          <w:rFonts w:ascii="Times New Roman" w:hAnsi="Times New Roman" w:cs="Times New Roman"/>
+        </w:rPr>
+        <w:t xml:space="preserve"> and status</w:t>
+      </w:r>
+      <w:r>
+        <w:rPr>
+          <w:rFonts w:ascii="Times New Roman" w:hAnsi="Times New Roman" w:cs="Times New Roman"/>
+        </w:rPr>
+        <w:t xml:space="preserve"> through </w:t>
+      </w:r>
+      <w:r>
+        <w:rPr>
+          <w:rFonts w:ascii="Times New Roman" w:hAnsi="Times New Roman" w:cs="Times New Roman"/>
+        </w:rPr>
+        <w:t xml:space="preserve">payments </w:t>
+      </w:r>
     </w:p>
     <w:sectPr>
       <w:pgSz w:w="12240" w:h="15840"/>

</xml_diff>